<commit_message>
Updated Design Pattern Notes
</commit_message>
<xml_diff>
--- a/Python OOPs.docx
+++ b/Python OOPs.docx
@@ -10,6 +10,7 @@
           <w:docPartUnique/>
         </w:docPartObj>
       </w:sdtPr>
+      <w:sdtEndPr/>
       <w:sdtContent>
         <w:p>
           <w:r>
@@ -133,6 +134,7 @@
                                     <w:dataBinding w:prefixMappings="xmlns:ns0='http://purl.org/dc/elements/1.1/' xmlns:ns1='http://schemas.openxmlformats.org/package/2006/metadata/core-properties' " w:xpath="/ns1:coreProperties[1]/ns0:creator[1]" w:storeItemID="{6C3C8BC8-F283-45AE-878A-BAB7291924A1}"/>
                                     <w:text/>
                                   </w:sdtPr>
+                                  <w:sdtEndPr/>
                                   <w:sdtContent>
                                     <w:p>
                                       <w:pPr>
@@ -173,6 +175,7 @@
                                       <w:dataBinding w:prefixMappings="xmlns:ns0='http://schemas.openxmlformats.org/officeDocument/2006/extended-properties' " w:xpath="/ns0:Properties[1]/ns0:Company[1]" w:storeItemID="{6668398D-A668-4E3E-A5EB-62B293D839F1}"/>
                                       <w:text/>
                                     </w:sdtPr>
+                                    <w:sdtEndPr/>
                                     <w:sdtContent>
                                       <w:r>
                                         <w:rPr>
@@ -249,6 +252,7 @@
                                     <w:dataBinding w:prefixMappings="xmlns:ns0='http://purl.org/dc/elements/1.1/' xmlns:ns1='http://schemas.openxmlformats.org/package/2006/metadata/core-properties' " w:xpath="/ns1:coreProperties[1]/ns0:title[1]" w:storeItemID="{6C3C8BC8-F283-45AE-878A-BAB7291924A1}"/>
                                     <w:text/>
                                   </w:sdtPr>
+                                  <w:sdtEndPr/>
                                   <w:sdtContent>
                                     <w:p>
                                       <w:pPr>
@@ -450,6 +454,13 @@
     </w:sdt>
     <w:sdt>
       <w:sdtPr>
+        <w:rPr>
+          <w:rFonts w:asciiTheme="minorHAnsi" w:eastAsiaTheme="minorHAnsi" w:hAnsiTheme="minorHAnsi" w:cstheme="minorBidi"/>
+          <w:color w:val="auto"/>
+          <w:sz w:val="22"/>
+          <w:szCs w:val="22"/>
+          <w:lang w:val="en-IN"/>
+        </w:rPr>
         <w:id w:val="-1513449918"/>
         <w:docPartObj>
           <w:docPartGallery w:val="Table of Contents"/>
@@ -458,14 +469,10 @@
       </w:sdtPr>
       <w:sdtEndPr>
         <w:rPr>
-          <w:rFonts w:asciiTheme="minorHAnsi" w:eastAsiaTheme="minorHAnsi" w:hAnsiTheme="minorHAnsi" w:cstheme="minorBidi"/>
           <w:b/>
           <w:bCs/>
           <w:noProof/>
-          <w:color w:val="auto"/>
           <w:sz w:val="24"/>
-          <w:szCs w:val="22"/>
-          <w:lang w:val="en-IN"/>
         </w:rPr>
       </w:sdtEndPr>
       <w:sdtContent>
@@ -3786,28 +3793,22 @@
           <w:b/>
         </w:rPr>
         <w:lastRenderedPageBreak/>
-        <w:t>Ch</w:t>
-      </w:r>
-      <w:bookmarkStart w:id="1" w:name="_GoBack"/>
+        <w:t>Chapter 1: Python Classes and Objects</w:t>
+      </w:r>
+      <w:bookmarkEnd w:id="0"/>
+    </w:p>
+    <w:p/>
+    <w:p>
+      <w:pPr>
+        <w:pStyle w:val="Heading2"/>
+      </w:pPr>
+      <w:bookmarkStart w:id="1" w:name="_Toc235356467"/>
+      <w:bookmarkStart w:id="2" w:name="_GoBack"/>
+      <w:bookmarkEnd w:id="2"/>
+      <w:r>
+        <w:t>1.1 What is a Class?</w:t>
+      </w:r>
       <w:bookmarkEnd w:id="1"/>
-      <w:r>
-        <w:rPr>
-          <w:b/>
-        </w:rPr>
-        <w:t>apter 1: Python Classes and Objects</w:t>
-      </w:r>
-      <w:bookmarkEnd w:id="0"/>
-    </w:p>
-    <w:p/>
-    <w:p>
-      <w:pPr>
-        <w:pStyle w:val="Heading2"/>
-      </w:pPr>
-      <w:bookmarkStart w:id="2" w:name="_Toc235356467"/>
-      <w:r>
-        <w:t>1.1 What is a Class?</w:t>
-      </w:r>
-      <w:bookmarkEnd w:id="2"/>
     </w:p>
     <w:p>
       <w:r>
@@ -16226,14 +16227,7 @@
       </w:r>
     </w:p>
     <w:p>
-      <w:pPr>
-        <w:pStyle w:val="Heading2"/>
-      </w:pPr>
-      <w:r>
-        <w:rPr>
-          <w:rFonts w:ascii="Courier New" w:hAnsi="Courier New"/>
-          <w:sz w:val="18"/>
-        </w:rPr>
+      <w:r>
         <w:br/>
       </w:r>
     </w:p>
@@ -28094,11 +28088,7 @@
         <w:t>#10</w:t>
       </w:r>
     </w:p>
-    <w:p>
-      <w:pPr>
-        <w:pStyle w:val="Heading2"/>
-      </w:pPr>
-    </w:p>
+    <w:p/>
     <w:p>
       <w:pPr>
         <w:pStyle w:val="Heading2"/>
@@ -30499,11 +30489,7 @@
         <w:t>Abstract Base Classes (ABC)</w:t>
       </w:r>
     </w:p>
-    <w:p>
-      <w:pPr>
-        <w:pStyle w:val="Heading2"/>
-      </w:pPr>
-    </w:p>
+    <w:p/>
     <w:p>
       <w:pPr>
         <w:pStyle w:val="Heading2"/>
@@ -32230,11 +32216,7 @@
         <w:t xml:space="preserve"> module provides a way to define a set of symbolic, named constant values. Enums are classes; each member is a singleton instance of that class. This improves readability and type-safety compared to raw strings/ints (magic values).</w:t>
       </w:r>
     </w:p>
-    <w:p>
-      <w:pPr>
-        <w:pStyle w:val="Heading2"/>
-      </w:pPr>
-    </w:p>
+    <w:p/>
     <w:p>
       <w:pPr>
         <w:pStyle w:val="Heading2"/>
@@ -37733,7 +37715,7 @@
           <w:rPr>
             <w:noProof/>
           </w:rPr>
-          <w:t>1</w:t>
+          <w:t>2</w:t>
         </w:r>
         <w:r>
           <w:rPr>
@@ -39822,6 +39804,7 @@
   <w:style w:type="character" w:default="1" w:styleId="DefaultParagraphFont">
     <w:name w:val="Default Paragraph Font"/>
     <w:uiPriority w:val="1"/>
+    <w:semiHidden/>
     <w:unhideWhenUsed/>
   </w:style>
   <w:style w:type="table" w:default="1" w:styleId="TableNormal">
@@ -40585,7 +40568,7 @@
 </file>
 
 <file path=customXml/itemProps1.xml><?xml version="1.0" encoding="utf-8"?>
-<ds:datastoreItem xmlns:ds="http://schemas.openxmlformats.org/officeDocument/2006/customXml" ds:itemID="{3C3869E1-BE26-4B9E-B053-4842F3D01BEB}">
+<ds:datastoreItem xmlns:ds="http://schemas.openxmlformats.org/officeDocument/2006/customXml" ds:itemID="{BC9228E2-F709-4A40-BF20-CA9BCC670C2B}">
   <ds:schemaRefs>
     <ds:schemaRef ds:uri="http://schemas.openxmlformats.org/officeDocument/2006/bibliography"/>
   </ds:schemaRefs>

</xml_diff>